<commit_message>
docs: update implementation document after fix issues found after testing
</commit_message>
<xml_diff>
--- a/Implementation Docs/Task4_Implementation.docx
+++ b/Implementation Docs/Task4_Implementation.docx
@@ -553,7 +553,51 @@
           <w:sz w:val="22"/>
           <w:szCs w:val="22"/>
         </w:rPr>
-        <w:t xml:space="preserve">The design doc's scope for the login page is styling only — no fields added, removed, or reordered, and no change to authentication logic or session handling. All changes are visual or markup only; signInWithEmail, zodResolver, and </w:t>
+        <w:t xml:space="preserve">The design doc's scope for the login page is styling only — no fields added, removed, or reordered, and no change to authentication logic or session handling. All changes are visual or markup only; </w:t>
+      </w:r>
+      <w:proofErr w:type="spellStart"/>
+      <w:r>
+        <w:rPr>
+          <w:rFonts w:asciiTheme="minorHAnsi" w:hAnsiTheme="minorHAnsi"/>
+          <w:i/>
+          <w:iCs/>
+          <w:sz w:val="22"/>
+          <w:szCs w:val="22"/>
+        </w:rPr>
+        <w:t>signInWithEmail</w:t>
+      </w:r>
+      <w:proofErr w:type="spellEnd"/>
+      <w:r>
+        <w:rPr>
+          <w:rFonts w:asciiTheme="minorHAnsi" w:hAnsiTheme="minorHAnsi"/>
+          <w:i/>
+          <w:iCs/>
+          <w:sz w:val="22"/>
+          <w:szCs w:val="22"/>
+        </w:rPr>
+        <w:t xml:space="preserve">, </w:t>
+      </w:r>
+      <w:proofErr w:type="spellStart"/>
+      <w:r>
+        <w:rPr>
+          <w:rFonts w:asciiTheme="minorHAnsi" w:hAnsiTheme="minorHAnsi"/>
+          <w:i/>
+          <w:iCs/>
+          <w:sz w:val="22"/>
+          <w:szCs w:val="22"/>
+        </w:rPr>
+        <w:t>zodResolver</w:t>
+      </w:r>
+      <w:proofErr w:type="spellEnd"/>
+      <w:r>
+        <w:rPr>
+          <w:rFonts w:asciiTheme="minorHAnsi" w:hAnsiTheme="minorHAnsi"/>
+          <w:i/>
+          <w:iCs/>
+          <w:sz w:val="22"/>
+          <w:szCs w:val="22"/>
+        </w:rPr>
+        <w:t xml:space="preserve">, and </w:t>
       </w:r>
       <w:proofErr w:type="spellStart"/>
       <w:r>
@@ -614,13 +658,14 @@
         <w:tblLook w:val="04A0" w:firstRow="1" w:lastRow="0" w:firstColumn="1" w:lastColumn="0" w:noHBand="0" w:noVBand="1"/>
       </w:tblPr>
       <w:tblGrid>
-        <w:gridCol w:w="4675"/>
-        <w:gridCol w:w="4675"/>
+        <w:gridCol w:w="3175"/>
+        <w:gridCol w:w="3001"/>
+        <w:gridCol w:w="3184"/>
       </w:tblGrid>
       <w:tr>
         <w:tc>
           <w:tcPr>
-            <w:tcW w:w="4675" w:type="dxa"/>
+            <w:tcW w:w="3175" w:type="dxa"/>
           </w:tcPr>
           <w:p>
             <w:pPr>
@@ -644,7 +689,7 @@
         </w:tc>
         <w:tc>
           <w:tcPr>
-            <w:tcW w:w="4675" w:type="dxa"/>
+            <w:tcW w:w="3001" w:type="dxa"/>
           </w:tcPr>
           <w:p>
             <w:pPr>
@@ -656,29 +701,29 @@
                 <w:szCs w:val="22"/>
               </w:rPr>
             </w:pPr>
-            <w:r>
+          </w:p>
+        </w:tc>
+        <w:tc>
+          <w:tcPr>
+            <w:tcW w:w="3184" w:type="dxa"/>
+          </w:tcPr>
+          <w:p>
+            <w:pPr>
+              <w:spacing w:after="150"/>
+              <w:jc w:val="right"/>
               <w:rPr>
                 <w:rFonts w:asciiTheme="minorHAnsi" w:hAnsiTheme="minorHAnsi"/>
                 <w:sz w:val="22"/>
                 <w:szCs w:val="22"/>
               </w:rPr>
-              <w:t>Sign In Page - E</w:t>
-            </w:r>
+            </w:pPr>
             <w:r>
               <w:rPr>
                 <w:rFonts w:asciiTheme="minorHAnsi" w:hAnsiTheme="minorHAnsi"/>
                 <w:sz w:val="22"/>
                 <w:szCs w:val="22"/>
               </w:rPr>
-              <w:t>dge</w:t>
-            </w:r>
-            <w:r>
-              <w:rPr>
-                <w:rFonts w:asciiTheme="minorHAnsi" w:hAnsiTheme="minorHAnsi"/>
-                <w:sz w:val="22"/>
-                <w:szCs w:val="22"/>
-              </w:rPr>
-              <w:t xml:space="preserve"> Case</w:t>
+              <w:t>Sign In Page - Edge Case</w:t>
             </w:r>
           </w:p>
         </w:tc>
@@ -696,15 +741,17 @@
       <w:r>
         <w:rPr>
           <w:rFonts w:asciiTheme="minorHAnsi" w:hAnsiTheme="minorHAnsi"/>
+          <w:i/>
+          <w:iCs/>
           <w:noProof/>
           <w:sz w:val="22"/>
           <w:szCs w:val="22"/>
         </w:rPr>
         <w:drawing>
-          <wp:inline distT="0" distB="0" distL="0" distR="0" wp14:anchorId="571E5775" wp14:editId="420E182B">
-            <wp:extent cx="3067200" cy="3405600"/>
-            <wp:effectExtent l="0" t="0" r="0" b="4445"/>
-            <wp:docPr id="847835999" name="Picture 1"/>
+          <wp:inline distT="0" distB="0" distL="0" distR="0" wp14:anchorId="4C4BE564" wp14:editId="61AE121A">
+            <wp:extent cx="3108960" cy="3803514"/>
+            <wp:effectExtent l="0" t="0" r="0" b="6985"/>
+            <wp:docPr id="2047127250" name="Picture 1"/>
             <wp:cNvGraphicFramePr>
               <a:graphicFrameLocks xmlns:a="http://schemas.openxmlformats.org/drawingml/2006/main" noChangeAspect="1"/>
             </wp:cNvGraphicFramePr>
@@ -712,7 +759,7 @@
               <a:graphicData uri="http://schemas.openxmlformats.org/drawingml/2006/picture">
                 <pic:pic xmlns:pic="http://schemas.openxmlformats.org/drawingml/2006/picture">
                   <pic:nvPicPr>
-                    <pic:cNvPr id="847835999" name="Picture 847835999"/>
+                    <pic:cNvPr id="2047127250" name="Picture 2047127250"/>
                     <pic:cNvPicPr/>
                   </pic:nvPicPr>
                   <pic:blipFill>
@@ -730,7 +777,7 @@
                   <pic:spPr>
                     <a:xfrm>
                       <a:off x="0" y="0"/>
-                      <a:ext cx="3067200" cy="3405600"/>
+                      <a:ext cx="3122688" cy="3820309"/>
                     </a:xfrm>
                     <a:prstGeom prst="rect">
                       <a:avLst/>
@@ -745,17 +792,14 @@
       <w:r>
         <w:rPr>
           <w:rFonts w:asciiTheme="minorHAnsi" w:hAnsiTheme="minorHAnsi"/>
-          <w:i/>
-          <w:iCs/>
           <w:noProof/>
-          <w:sz w:val="22"/>
-          <w:szCs w:val="22"/>
+          <w:color w:val="auto"/>
         </w:rPr>
         <w:drawing>
-          <wp:inline distT="0" distB="0" distL="0" distR="0" wp14:anchorId="60C85E00" wp14:editId="01CB0E28">
-            <wp:extent cx="2699306" cy="3405600"/>
-            <wp:effectExtent l="0" t="0" r="6350" b="4445"/>
-            <wp:docPr id="736893407" name="Picture 2"/>
+          <wp:inline distT="0" distB="0" distL="0" distR="0" wp14:anchorId="50D2198F" wp14:editId="6641BECB">
+            <wp:extent cx="2823210" cy="3830950"/>
+            <wp:effectExtent l="0" t="0" r="0" b="0"/>
+            <wp:docPr id="1587359601" name="Picture 2"/>
             <wp:cNvGraphicFramePr>
               <a:graphicFrameLocks xmlns:a="http://schemas.openxmlformats.org/drawingml/2006/main" noChangeAspect="1"/>
             </wp:cNvGraphicFramePr>
@@ -763,7 +807,7 @@
               <a:graphicData uri="http://schemas.openxmlformats.org/drawingml/2006/picture">
                 <pic:pic xmlns:pic="http://schemas.openxmlformats.org/drawingml/2006/picture">
                   <pic:nvPicPr>
-                    <pic:cNvPr id="736893407" name="Picture 736893407"/>
+                    <pic:cNvPr id="1587359601" name="Picture 1587359601"/>
                     <pic:cNvPicPr/>
                   </pic:nvPicPr>
                   <pic:blipFill>
@@ -781,7 +825,7 @@
                   <pic:spPr>
                     <a:xfrm>
                       <a:off x="0" y="0"/>
-                      <a:ext cx="2699306" cy="3405600"/>
+                      <a:ext cx="2840017" cy="3853756"/>
                     </a:xfrm>
                     <a:prstGeom prst="rect">
                       <a:avLst/>
@@ -877,7 +921,23 @@
           <w:sz w:val="22"/>
           <w:szCs w:val="22"/>
         </w:rPr>
-        <w:t>frontend/src/app/(auth)/auth/signin/page.tsx — card, inputs, button, and links restyled; Google sign-in removed; credential-error banner added</w:t>
+        <w:t>frontend/src/app/(auth)/auth/signin/page.tsx — card, inputs, button, and links restyled; Google sign-in removed; credential-error banner</w:t>
+      </w:r>
+      <w:r>
+        <w:rPr>
+          <w:rFonts w:asciiTheme="minorHAnsi" w:hAnsiTheme="minorHAnsi"/>
+          <w:sz w:val="22"/>
+          <w:szCs w:val="22"/>
+        </w:rPr>
+        <w:t>, forgot password button</w:t>
+      </w:r>
+      <w:r>
+        <w:rPr>
+          <w:rFonts w:asciiTheme="minorHAnsi" w:hAnsiTheme="minorHAnsi"/>
+          <w:sz w:val="22"/>
+          <w:szCs w:val="22"/>
+        </w:rPr>
+        <w:t xml:space="preserve"> added</w:t>
       </w:r>
     </w:p>
     <w:p>
@@ -1047,6 +1107,7 @@
           <w:sz w:val="22"/>
           <w:szCs w:val="22"/>
         </w:rPr>
+        <w:lastRenderedPageBreak/>
         <w:t xml:space="preserve">Submit a valid email with the wrong password. A red banner should appear above the form, matching the login error </w:t>
       </w:r>
       <w:r>
@@ -1093,7 +1154,6 @@
         <w:rPr>
           <w:rFonts w:asciiTheme="minorHAnsi" w:hAnsiTheme="minorHAnsi"/>
         </w:rPr>
-        <w:lastRenderedPageBreak/>
         <w:t>4. Verification</w:t>
       </w:r>
     </w:p>

</xml_diff>